<commit_message>
Fix inflated comparison count: 22 -> 11 of 11 cuts (17 distinct)
The '22 comparisons' double-counted the 5 fixed-length cuts, which are the
identical computation in both the headline and population-control blocks. Honest
count: 11 of 11 headline cuts all exclude zero; 17 distinct comparisons
including the population-control k%-on-781 re-run. Fixed across exec summary,
write-up body, form answers, EXPERIMENT.md, RESULTS.md; combined doc + docx
rebuilt.

Co-Authored-By: Claude Opus 5 <noreply@anthropic.com>
</commit_message>
<xml_diff>
--- a/The_Probe_Text_Gap.docx
+++ b/The_Probe_Text_Gap.docx
@@ -129,7 +129,7 @@
         <w:t>advantage</w:t>
       </w:r>
       <w:r>
-        <w:t>. A linear probe on activations is a real predictor of final correctness, but a single bag-of-words reader of the same trace text beats it at every cut I tested — 22 of 22 comparisons, every 95% interval excluding zero, under a search budget matched to the probe. The contribution is the measurement and two structural lessons that come with it.</w:t>
+        <w:t>. A linear probe on activations is a real predictor of final correctness, but a single bag-of-words reader of the same trace text beats it at every cut I tested — all 11 cuts, every 95% interval excluding zero, and again when the k% grid is re-run on the fixed-length population (17 distinct comparisons in all) — under a search budget matched to the probe. The contribution is the measurement and two structural lessons that come with it.</w:t>
       </w:r>
     </w:p>
     <w:p>
@@ -1821,10 +1821,10 @@
         <w:rPr>
           <w:b/>
         </w:rPr>
-        <w:t>11 of 11 cuts, and all 11 again when the k% grid is re-run on the fixed-length population — 22 comparisons in total.</w:t>
+        <w:t>11 of 11 cuts, and again when the k% grid is re-run on the fixed-length population — 17 distinct comparisons in all</w:t>
       </w:r>
       <w:r>
-        <w:t xml:space="preserve"> More data and a fair budget did not rescue the probe; they made the loss universal and resolved. The generous 280-config probe (Run 011) reaches ~0.76–0.78 on the k% grid — higher, because searching 35 layers helps — but it still loses to TF-IDF at every cut. Whether the probe gets one configuration or hundreds, it does not beat a single bag-of-words reader.</w:t>
+        <w:t xml:space="preserve"> (the five fixed-length cuts are shared between the two analyses, so I count them once). More data and a fair budget did not rescue the probe; they made the loss universal and resolved. The generous 280-config probe (Run 011) reaches ~0.76–0.78 on the k% grid — higher, because searching 35 layers helps — but it still loses to TF-IDF at every cut. Whether the probe gets one configuration or hundreds, it does not beat a single bag-of-words reader.</w:t>
       </w:r>
     </w:p>
     <w:p>

</xml_diff>

<commit_message>
Add the decoupling figure (fig3): commitment precedes legibility
Replace the commitment-only fig3 with the paper's headline figure: forced-answer
agreement (climbs to ~97%) against the best correctness reader's ROC-AUC
(plateaus ~0.8) on a shared [0.5,1] axis, with the legibility gap shaded. Shows
the model settles WHAT it will say long before WHETHER it is right is readable;
probe shown for reference. Wired into the exec summary at the commitment finding
(travels with it when promoted to Finding 1) with caption; body Figure 3
reference already frames it. Combined doc + docx rebuilt (3 exec figures).

Co-Authored-By: Claude Opus 5 <noreply@anthropic.com>
</commit_message>
<xml_diff>
--- a/The_Probe_Text_Gap.docx
+++ b/The_Probe_Text_Gap.docx
@@ -462,6 +462,60 @@
       </w:r>
       <w:r>
         <w:t>. This finding does not depend on any tuning choice.</w:t>
+      </w:r>
+    </w:p>
+    <w:p>
+      <w:pPr>
+        <w:spacing w:before="120"/>
+        <w:jc w:val="center"/>
+      </w:pPr>
+      <w:r>
+        <w:drawing>
+          <wp:inline xmlns:a="http://schemas.openxmlformats.org/drawingml/2006/main" xmlns:pic="http://schemas.openxmlformats.org/drawingml/2006/picture">
+            <wp:extent cx="5577840" cy="3449454"/>
+            <wp:docPr id="3" name="Picture 3"/>
+            <wp:cNvGraphicFramePr>
+              <a:graphicFrameLocks noChangeAspect="1"/>
+            </wp:cNvGraphicFramePr>
+            <a:graphic>
+              <a:graphicData uri="http://schemas.openxmlformats.org/drawingml/2006/picture">
+                <pic:pic>
+                  <pic:nvPicPr>
+                    <pic:cNvPr id="0" name="fig3_decoupling.png"/>
+                    <pic:cNvPicPr/>
+                  </pic:nvPicPr>
+                  <pic:blipFill>
+                    <a:blip r:embed="rId12"/>
+                    <a:stretch>
+                      <a:fillRect/>
+                    </a:stretch>
+                  </pic:blipFill>
+                  <pic:spPr>
+                    <a:xfrm>
+                      <a:off x="0" y="0"/>
+                      <a:ext cx="5577840" cy="3449454"/>
+                    </a:xfrm>
+                    <a:prstGeom prst="rect"/>
+                  </pic:spPr>
+                </pic:pic>
+              </a:graphicData>
+            </a:graphic>
+          </wp:inline>
+        </w:drawing>
+      </w:r>
+    </w:p>
+    <w:p>
+      <w:pPr>
+        <w:spacing w:before="60" w:after="240"/>
+        <w:jc w:val="center"/>
+      </w:pPr>
+      <w:r>
+        <w:rPr>
+          <w:i/>
+          <w:color w:val="5A636E"/>
+          <w:sz w:val="17"/>
+        </w:rPr>
+        <w:t>Figure 3. Commitment precedes legibility. The forced-answer agreement curve (purple) climbs from chance to ~97% — the model settles what it will say — while the best correctness reader (red, ROC-AUC) plateaus near 0.8. Two different quantities, both on [0.5, 1]: by mid-trace the answer is largely fixed, yet whether it is right stays only moderately readable.</w:t>
       </w:r>
     </w:p>
     <w:p>

</xml_diff>

<commit_message>
Insert real repo URL now that the repo is public
Repo flipped to PUBLIC (github.com/isahan78/ais-research). Replaced the
[public GitHub link] placeholder in the exec summary and added the URL to the
form answers repro note; combined doc + docx rebuilt.

Co-Authored-By: Claude Opus 5 <noreply@anthropic.com>
</commit_message>
<xml_diff>
--- a/The_Probe_Text_Gap.docx
+++ b/The_Probe_Text_Gap.docx
@@ -36,7 +36,7 @@
           <w:color w:val="5A636E"/>
           <w:sz w:val="20"/>
         </w:rPr>
-        <w:t>Repo: [public GitHub link] · every number traces to a committed artifact</w:t>
+        <w:t>Repo: https://github.com/isahan78/ais-research · every number traces to a committed artifact</w:t>
       </w:r>
     </w:p>
     <w:p>
@@ -566,7 +566,17 @@
         <w:t>Repo:</w:t>
       </w:r>
       <w:r>
-        <w:t xml:space="preserve"> [public GitHub link] — raw traces, every run with provenance, the three sealed pre-registrations (all three wrong, and that is the point), and the review scripts that found the error in my own headline result.</w:t>
+        <w:t xml:space="preserve"> </w:t>
+      </w:r>
+      <w:r>
+        <w:rPr>
+          <w:color w:val="2C5F8A"/>
+          <w:u w:val="single"/>
+        </w:rPr>
+        <w:t>github.com/isahan78/ais-research</w:t>
+      </w:r>
+      <w:r>
+        <w:t xml:space="preserve"> — raw traces, every run with provenance, the three sealed pre-registrations (all three wrong, and that is the point), and the review scripts that found the error in my own headline result.</w:t>
       </w:r>
     </w:p>
     <w:p>

</xml_diff>